<commit_message>
podpunkty e) i f) dokumentacji
</commit_message>
<xml_diff>
--- a/Dokumentacja_projekt.docx
+++ b/Dokumentacja_projekt.docx
@@ -4,6 +4,11 @@
   <w:body>
     <w:p>
       <w:pPr>
+        <w:pStyle w:val="Akapitzlist"/>
+        <w:numPr>
+          <w:ilvl w:val="0"/>
+          <w:numId w:val="11"/>
+        </w:numPr>
         <w:rPr>
           <w:b/>
           <w:bCs/>
@@ -18,7 +23,25 @@
           <w:sz w:val="48"/>
           <w:szCs w:val="48"/>
         </w:rPr>
-        <w:t>A)</w:t>
+        <w:t>S</w:t>
+      </w:r>
+      <w:r>
+        <w:rPr>
+          <w:b/>
+          <w:bCs/>
+          <w:sz w:val="48"/>
+          <w:szCs w:val="48"/>
+        </w:rPr>
+        <w:t>pecyfikację tematu projektu w postaci przedstawienia projektowanej rzeczywistośc</w:t>
+      </w:r>
+      <w:r>
+        <w:rPr>
+          <w:b/>
+          <w:bCs/>
+          <w:sz w:val="48"/>
+          <w:szCs w:val="48"/>
+        </w:rPr>
+        <w:t>i</w:t>
       </w:r>
     </w:p>
     <w:p>
@@ -87,6 +110,11 @@
     <w:p/>
     <w:p>
       <w:pPr>
+        <w:pStyle w:val="Akapitzlist"/>
+        <w:numPr>
+          <w:ilvl w:val="0"/>
+          <w:numId w:val="11"/>
+        </w:numPr>
         <w:rPr>
           <w:b/>
           <w:bCs/>
@@ -101,17 +129,7 @@
           <w:sz w:val="48"/>
           <w:szCs w:val="48"/>
         </w:rPr>
-        <w:lastRenderedPageBreak/>
-        <w:t>B</w:t>
-      </w:r>
-      <w:r>
-        <w:rPr>
-          <w:b/>
-          <w:bCs/>
-          <w:sz w:val="48"/>
-          <w:szCs w:val="48"/>
-        </w:rPr>
-        <w:t>)</w:t>
+        <w:t>aspekt projektowy bazy danych</w:t>
       </w:r>
     </w:p>
     <w:p/>
@@ -138,9 +156,11 @@
       <w:r>
         <w:t xml:space="preserve"> (</w:t>
       </w:r>
+      <w:proofErr w:type="spellStart"/>
       <w:r>
         <w:t>zwierze_id</w:t>
       </w:r>
+      <w:proofErr w:type="spellEnd"/>
       <w:r>
         <w:t>, imię,</w:t>
       </w:r>
@@ -148,13 +168,31 @@
         <w:t xml:space="preserve"> rodzaj, </w:t>
       </w:r>
       <w:r>
-        <w:t xml:space="preserve"> rasa, wiek, płeć, status, opiekun_id, </w:t>
-      </w:r>
+        <w:t xml:space="preserve"> rasa, wiek, płeć, status, </w:t>
+      </w:r>
+      <w:proofErr w:type="spellStart"/>
+      <w:r>
+        <w:t>opiekun_id</w:t>
+      </w:r>
+      <w:proofErr w:type="spellEnd"/>
+      <w:r>
+        <w:t xml:space="preserve">, </w:t>
+      </w:r>
+      <w:proofErr w:type="spellStart"/>
       <w:r>
         <w:t>numer_kojca</w:t>
       </w:r>
-      <w:r>
-        <w:t>, data_przyjęcia) </w:t>
+      <w:proofErr w:type="spellEnd"/>
+      <w:r>
+        <w:t xml:space="preserve">, </w:t>
+      </w:r>
+      <w:proofErr w:type="spellStart"/>
+      <w:r>
+        <w:t>data_przyjęcia</w:t>
+      </w:r>
+      <w:proofErr w:type="spellEnd"/>
+      <w:r>
+        <w:t>) </w:t>
       </w:r>
     </w:p>
     <w:p>
@@ -174,8 +212,13 @@
       <w:r>
         <w:t xml:space="preserve"> (</w:t>
       </w:r>
-      <w:r>
-        <w:t xml:space="preserve">kojec_id, </w:t>
+      <w:proofErr w:type="spellStart"/>
+      <w:r>
+        <w:t>kojec_id</w:t>
+      </w:r>
+      <w:proofErr w:type="spellEnd"/>
+      <w:r>
+        <w:t xml:space="preserve">, </w:t>
       </w:r>
       <w:r>
         <w:t>numer, wielkość) </w:t>
@@ -198,11 +241,29 @@
       <w:r>
         <w:t xml:space="preserve"> (</w:t>
       </w:r>
+      <w:proofErr w:type="spellStart"/>
       <w:r>
         <w:t>pracownik_id</w:t>
       </w:r>
-      <w:r>
-        <w:t>, imię, nazwisko, pensja, stanowisko, adres, data_zatrudnienia, data_zakończenia) </w:t>
+      <w:proofErr w:type="spellEnd"/>
+      <w:r>
+        <w:t xml:space="preserve">, imię, nazwisko, pensja, stanowisko, adres, </w:t>
+      </w:r>
+      <w:proofErr w:type="spellStart"/>
+      <w:r>
+        <w:t>data_zatrudnienia</w:t>
+      </w:r>
+      <w:proofErr w:type="spellEnd"/>
+      <w:r>
+        <w:t xml:space="preserve">, </w:t>
+      </w:r>
+      <w:proofErr w:type="spellStart"/>
+      <w:r>
+        <w:t>data_zakończenia</w:t>
+      </w:r>
+      <w:proofErr w:type="spellEnd"/>
+      <w:r>
+        <w:t>) </w:t>
       </w:r>
     </w:p>
     <w:p>
@@ -222,18 +283,46 @@
       <w:r>
         <w:t xml:space="preserve"> (</w:t>
       </w:r>
+      <w:proofErr w:type="spellStart"/>
       <w:r>
         <w:t>adopcja_id</w:t>
       </w:r>
-      <w:r>
-        <w:t xml:space="preserve">, data_adopcji, osoba_adoptujaca_id, zwierzak_id, </w:t>
-      </w:r>
+      <w:proofErr w:type="spellEnd"/>
+      <w:r>
+        <w:t xml:space="preserve">, </w:t>
+      </w:r>
+      <w:proofErr w:type="spellStart"/>
+      <w:r>
+        <w:t>data_adopcji</w:t>
+      </w:r>
+      <w:proofErr w:type="spellEnd"/>
+      <w:r>
+        <w:t xml:space="preserve">, </w:t>
+      </w:r>
+      <w:proofErr w:type="spellStart"/>
+      <w:r>
+        <w:t>osoba_adoptujaca_id</w:t>
+      </w:r>
+      <w:proofErr w:type="spellEnd"/>
+      <w:r>
+        <w:t xml:space="preserve">, </w:t>
+      </w:r>
+      <w:proofErr w:type="spellStart"/>
+      <w:r>
+        <w:t>zwierzak_id</w:t>
+      </w:r>
+      <w:proofErr w:type="spellEnd"/>
+      <w:r>
+        <w:t xml:space="preserve">, </w:t>
+      </w:r>
+      <w:proofErr w:type="spellStart"/>
       <w:r>
         <w:rPr>
           <w:u w:val="single"/>
         </w:rPr>
         <w:t>pracownik_id</w:t>
       </w:r>
+      <w:proofErr w:type="spellEnd"/>
       <w:r>
         <w:t>) </w:t>
       </w:r>
@@ -255,9 +344,11 @@
       <w:r>
         <w:t xml:space="preserve"> (</w:t>
       </w:r>
+      <w:proofErr w:type="spellStart"/>
       <w:r>
         <w:t>adopter_id</w:t>
       </w:r>
+      <w:proofErr w:type="spellEnd"/>
       <w:r>
         <w:t xml:space="preserve">, imię, nazwisko, adres, </w:t>
       </w:r>
@@ -285,11 +376,21 @@
       <w:r>
         <w:t xml:space="preserve"> (</w:t>
       </w:r>
+      <w:proofErr w:type="spellStart"/>
       <w:r>
         <w:t>darowizna_id</w:t>
       </w:r>
-      <w:r>
-        <w:t>, darczyńca_id, kwota , data) </w:t>
+      <w:proofErr w:type="spellEnd"/>
+      <w:r>
+        <w:t xml:space="preserve">, </w:t>
+      </w:r>
+      <w:proofErr w:type="spellStart"/>
+      <w:r>
+        <w:t>darczyńca_id</w:t>
+      </w:r>
+      <w:proofErr w:type="spellEnd"/>
+      <w:r>
+        <w:t>, kwota , data) </w:t>
       </w:r>
     </w:p>
     <w:p>
@@ -309,9 +410,11 @@
       <w:r>
         <w:t xml:space="preserve"> (</w:t>
       </w:r>
+      <w:proofErr w:type="spellStart"/>
       <w:r>
         <w:t>darczynca_id</w:t>
       </w:r>
+      <w:proofErr w:type="spellEnd"/>
       <w:r>
         <w:t xml:space="preserve">, </w:t>
       </w:r>
@@ -329,6 +432,7 @@
         <w:rPr>
           <w:noProof/>
         </w:rPr>
+        <w:lastRenderedPageBreak/>
         <w:drawing>
           <wp:inline distT="0" distB="0" distL="0" distR="0" wp14:anchorId="22D3FC14" wp14:editId="0F07A5E4">
             <wp:extent cx="5760720" cy="3153410"/>
@@ -382,6 +486,11 @@
     <w:p/>
     <w:p>
       <w:pPr>
+        <w:pStyle w:val="Akapitzlist"/>
+        <w:numPr>
+          <w:ilvl w:val="0"/>
+          <w:numId w:val="11"/>
+        </w:numPr>
         <w:rPr>
           <w:b/>
           <w:bCs/>
@@ -396,18 +505,116 @@
           <w:sz w:val="48"/>
           <w:szCs w:val="48"/>
         </w:rPr>
-        <w:lastRenderedPageBreak/>
-        <w:t>C</w:t>
-      </w:r>
-      <w:r>
+        <w:t>Aspekt projektowy niezbędnych funkcjonalności, które zostaną zaimplementowane po stronie bazy danych</w:t>
+      </w:r>
+    </w:p>
+    <w:p>
+      <w:pPr>
         <w:rPr>
           <w:b/>
           <w:bCs/>
           <w:sz w:val="48"/>
           <w:szCs w:val="48"/>
         </w:rPr>
+      </w:pPr>
+    </w:p>
+    <w:p>
+      <w:pPr>
+        <w:pStyle w:val="Akapitzlist"/>
+        <w:numPr>
+          <w:ilvl w:val="1"/>
+          <w:numId w:val="6"/>
+        </w:numPr>
+      </w:pPr>
+      <w:r>
+        <w:t xml:space="preserve">Sekwencje, </w:t>
+      </w:r>
+      <w:r>
+        <w:t>które pozwalają na automatyczne generowanie wartości klucza głównego dla nowo generowanych danych.</w:t>
+      </w:r>
+    </w:p>
+    <w:p>
+      <w:pPr>
+        <w:pStyle w:val="Akapitzlist"/>
+        <w:numPr>
+          <w:ilvl w:val="1"/>
+          <w:numId w:val="6"/>
+        </w:numPr>
+      </w:pPr>
+      <w:r>
+        <w:t>Opcje Dodawania, Edycji i Usuwania</w:t>
+      </w:r>
+      <w:r>
+        <w:t xml:space="preserve"> dla wszystkich encji dostępnych w bazie</w:t>
+      </w:r>
+      <w:r>
+        <w:t xml:space="preserve">. </w:t>
+      </w:r>
+      <w:r>
+        <w:t>Wyjątkiem jest ta</w:t>
+      </w:r>
+      <w:r>
+        <w:t>bela „Rejestr adopcji”, dla której nie przewidziano edycji poszczególnych adopcji.</w:t>
+      </w:r>
+    </w:p>
+    <w:p>
+      <w:pPr>
+        <w:pStyle w:val="Akapitzlist"/>
+        <w:numPr>
+          <w:ilvl w:val="1"/>
+          <w:numId w:val="6"/>
+        </w:numPr>
+      </w:pPr>
+      <w:r>
+        <w:t>Funkcje pobierania mniej lub bardziej przetworzonych danych.</w:t>
+      </w:r>
+      <w:r>
+        <w:t xml:space="preserve"> (więcej w </w:t>
+      </w:r>
+      <w:proofErr w:type="spellStart"/>
+      <w:r>
+        <w:t>podpuncie</w:t>
+      </w:r>
+      <w:proofErr w:type="spellEnd"/>
+      <w:r>
+        <w:t xml:space="preserve"> </w:t>
+      </w:r>
+      <w:r>
+        <w:rPr>
+          <w:b/>
+          <w:bCs/>
+          <w:u w:val="single"/>
+        </w:rPr>
+        <w:t>d)</w:t>
+      </w:r>
+      <w:r>
         <w:t>)</w:t>
       </w:r>
+    </w:p>
+    <w:p>
+      <w:pPr>
+        <w:pStyle w:val="Akapitzlist"/>
+        <w:numPr>
+          <w:ilvl w:val="1"/>
+          <w:numId w:val="6"/>
+        </w:numPr>
+      </w:pPr>
+      <w:r>
+        <w:t>Wyodrębnienie wszystkich funkcjonalności w poszczególne pakiety, w taki sposób aby jeden pakiet łączył funkcjonalności dotyczącej jednej tabeli</w:t>
+      </w:r>
+    </w:p>
+    <w:p>
+      <w:pPr>
+        <w:pStyle w:val="Akapitzlist"/>
+        <w:numPr>
+          <w:ilvl w:val="0"/>
+          <w:numId w:val="11"/>
+        </w:numPr>
+        <w:rPr>
+          <w:sz w:val="48"/>
+          <w:szCs w:val="48"/>
+        </w:rPr>
+      </w:pPr>
       <w:r>
         <w:rPr>
           <w:b/>
@@ -415,118 +622,46 @@
           <w:sz w:val="48"/>
           <w:szCs w:val="48"/>
         </w:rPr>
-        <w:t xml:space="preserve"> </w:t>
-      </w:r>
-      <w:r>
-        <w:t xml:space="preserve"> </w:t>
-      </w:r>
-      <w:r>
-        <w:rPr>
-          <w:b/>
-          <w:bCs/>
-          <w:sz w:val="48"/>
-          <w:szCs w:val="48"/>
-        </w:rPr>
-        <w:t>A</w:t>
-      </w:r>
-      <w:r>
-        <w:rPr>
-          <w:b/>
-          <w:bCs/>
-          <w:sz w:val="48"/>
-          <w:szCs w:val="48"/>
-        </w:rPr>
-        <w:t>spekt projektowy niezbędnych funkcjonalności, które zostaną zaimplementowane po stronie bazy danych</w:t>
-      </w:r>
-    </w:p>
-    <w:p>
-      <w:pPr>
-        <w:rPr>
-          <w:b/>
-          <w:bCs/>
-          <w:sz w:val="48"/>
-          <w:szCs w:val="48"/>
-        </w:rPr>
-      </w:pPr>
-    </w:p>
-    <w:p>
-      <w:r>
-        <w:t xml:space="preserve">1. Sekwencje, </w:t>
-      </w:r>
-      <w:r>
-        <w:t>które pozwalają na automatyczne generowanie wartości klucza głównego dla nowo generowanych danych.</w:t>
-      </w:r>
-    </w:p>
-    <w:p>
-      <w:r>
-        <w:t>2</w:t>
-      </w:r>
-      <w:r>
-        <w:t>. Opcje Dodawania, Edycji i Usuwania</w:t>
-      </w:r>
-      <w:r>
-        <w:t xml:space="preserve"> dla wszystkich encji dostępnych w bazie</w:t>
-      </w:r>
-      <w:r>
-        <w:t xml:space="preserve">. </w:t>
-      </w:r>
-      <w:r>
-        <w:t>Wyjątkiem jest ta</w:t>
-      </w:r>
-      <w:r>
-        <w:t>bela „Rejestr adopcji”, dla której nie przewidziano edycji poszczególnych adopcji.</w:t>
-      </w:r>
-    </w:p>
-    <w:p>
-      <w:r>
-        <w:t>3</w:t>
-      </w:r>
-      <w:r>
-        <w:t>. Funkcje pobierania mniej lub bardziej przetworzonych danych.</w:t>
-      </w:r>
-      <w:r>
-        <w:t xml:space="preserve"> (więcej w podpuncie </w:t>
-      </w:r>
-      <w:r>
-        <w:rPr>
-          <w:b/>
-          <w:bCs/>
+        <w:lastRenderedPageBreak/>
+        <w:t>funkcjonalności, które zostaną zaimplementowane po stronie bazy danych</w:t>
+      </w:r>
+    </w:p>
+    <w:p>
+      <w:r>
+        <w:t>Baza danych zosta</w:t>
+      </w:r>
+      <w:r>
+        <w:t xml:space="preserve">ła zaimplementowana w Oracle Database 21c. </w:t>
+      </w:r>
+      <w:r>
+        <w:t>Każda funkcjonalność została napisana w języku PL/SQL.</w:t>
+      </w:r>
+    </w:p>
+    <w:p>
+      <w:r>
+        <w:t xml:space="preserve">Ostateczny schemat ERD bazy uległ zmianie. Podjęto decyzję o likwidacji tabeli </w:t>
+      </w:r>
+      <w:proofErr w:type="spellStart"/>
+      <w:r>
+        <w:rPr>
           <w:u w:val="single"/>
         </w:rPr>
-        <w:t>d)</w:t>
-      </w:r>
-      <w:r>
-        <w:t>)</w:t>
-      </w:r>
-    </w:p>
-    <w:p>
-      <w:r>
-        <w:t>4</w:t>
-      </w:r>
-      <w:r>
-        <w:t xml:space="preserve">. </w:t>
-      </w:r>
-      <w:r>
-        <w:t>Wyodrębnienie wszystkich funkcjonalności w poszczególne pakiety, w taki sposób aby jeden pakiet łączył funkcjonalności dotyczącej jednej tabeli</w:t>
-      </w:r>
-    </w:p>
-    <w:p>
-      <w:pPr>
-        <w:rPr>
-          <w:b/>
-          <w:bCs/>
-          <w:sz w:val="48"/>
-          <w:szCs w:val="48"/>
-        </w:rPr>
-      </w:pPr>
-      <w:r>
-        <w:rPr>
-          <w:b/>
-          <w:bCs/>
-          <w:sz w:val="48"/>
-          <w:szCs w:val="48"/>
-        </w:rPr>
-        <w:t>D) przedstawienie powstałej bazy danych wraz z wdrożonymi mechanizmami po jej stronie</w:t>
+        <w:t>Osoby_adoptujące</w:t>
+      </w:r>
+      <w:proofErr w:type="spellEnd"/>
+      <w:r>
+        <w:t xml:space="preserve">, jako że ilość danych w niej zawarta była bardzo ograniczona. Dane zawarte w tej tabeli zostały zawarte bezpośrednio w tabeli </w:t>
+      </w:r>
+      <w:proofErr w:type="spellStart"/>
+      <w:r>
+        <w:rPr>
+          <w:u w:val="single"/>
+        </w:rPr>
+        <w:t>Rejestr_adopcji</w:t>
+      </w:r>
+      <w:proofErr w:type="spellEnd"/>
+      <w:r>
+        <w:t>.</w:t>
       </w:r>
     </w:p>
     <w:p>
@@ -538,83 +673,8 @@
       </w:pPr>
       <w:r>
         <w:rPr>
-          <w:sz w:val="36"/>
-          <w:szCs w:val="36"/>
-        </w:rPr>
-        <w:t>Baza danych zosta</w:t>
-      </w:r>
-      <w:r>
-        <w:rPr>
-          <w:sz w:val="36"/>
-          <w:szCs w:val="36"/>
-        </w:rPr>
-        <w:t xml:space="preserve">ła zaimplementowana w Oracle Database 21c. </w:t>
-      </w:r>
-      <w:r>
-        <w:rPr>
-          <w:sz w:val="36"/>
-          <w:szCs w:val="36"/>
-        </w:rPr>
-        <w:t>Każda funkcjonalność została napisana w języku PL/SQL.</w:t>
-      </w:r>
-    </w:p>
-    <w:p>
-      <w:pPr>
-        <w:rPr>
-          <w:sz w:val="36"/>
-          <w:szCs w:val="36"/>
-        </w:rPr>
-      </w:pPr>
-      <w:r>
-        <w:rPr>
-          <w:sz w:val="36"/>
-          <w:szCs w:val="36"/>
-        </w:rPr>
-        <w:t xml:space="preserve">Ostateczny schemat ERD bazy uległ zmianie. Podjęto decyzję o likwidacji tabeli </w:t>
-      </w:r>
-      <w:r>
-        <w:rPr>
-          <w:sz w:val="36"/>
-          <w:szCs w:val="36"/>
-          <w:u w:val="single"/>
-        </w:rPr>
-        <w:t>Osoby_adoptujące</w:t>
-      </w:r>
-      <w:r>
-        <w:rPr>
-          <w:sz w:val="36"/>
-          <w:szCs w:val="36"/>
-        </w:rPr>
-        <w:t xml:space="preserve">, jako że ilość danych w niej zawarta była bardzo ograniczona. Dane zawarte w tej tabeli zostały zawarte bezpośrednio w tabeli </w:t>
-      </w:r>
-      <w:r>
-        <w:rPr>
-          <w:sz w:val="36"/>
-          <w:szCs w:val="36"/>
-          <w:u w:val="single"/>
-        </w:rPr>
-        <w:t>Rejestr_adopcji</w:t>
-      </w:r>
-      <w:r>
-        <w:rPr>
-          <w:sz w:val="36"/>
-          <w:szCs w:val="36"/>
-        </w:rPr>
-        <w:t>.</w:t>
-      </w:r>
-    </w:p>
-    <w:p>
-      <w:pPr>
-        <w:rPr>
-          <w:sz w:val="36"/>
-          <w:szCs w:val="36"/>
-        </w:rPr>
-      </w:pPr>
-      <w:r>
-        <w:rPr>
           <w:noProof/>
         </w:rPr>
-        <w:lastRenderedPageBreak/>
         <w:drawing>
           <wp:inline distT="0" distB="0" distL="0" distR="0" wp14:anchorId="3E9E4CFA" wp14:editId="3973F152">
             <wp:extent cx="5760720" cy="3768090"/>
@@ -672,7 +732,23 @@
           <w:sz w:val="48"/>
           <w:szCs w:val="48"/>
         </w:rPr>
-        <w:t>Szczegóły impementacji bazy danych.</w:t>
+        <w:t xml:space="preserve">Szczegóły </w:t>
+      </w:r>
+      <w:proofErr w:type="spellStart"/>
+      <w:r>
+        <w:rPr>
+          <w:sz w:val="48"/>
+          <w:szCs w:val="48"/>
+        </w:rPr>
+        <w:t>impementacji</w:t>
+      </w:r>
+      <w:proofErr w:type="spellEnd"/>
+      <w:r>
+        <w:rPr>
+          <w:sz w:val="48"/>
+          <w:szCs w:val="48"/>
+        </w:rPr>
+        <w:t xml:space="preserve"> bazy danych.</w:t>
       </w:r>
     </w:p>
     <w:p>
@@ -685,6 +761,7 @@
         <w:rPr>
           <w:noProof/>
         </w:rPr>
+        <w:lastRenderedPageBreak/>
         <w:drawing>
           <wp:inline distT="0" distB="0" distL="0" distR="0" wp14:anchorId="532B7C92" wp14:editId="3AD9C55B">
             <wp:extent cx="2447925" cy="2838450"/>
@@ -740,7 +817,6 @@
         <w:rPr>
           <w:noProof/>
         </w:rPr>
-        <w:lastRenderedPageBreak/>
         <w:drawing>
           <wp:inline distT="0" distB="0" distL="0" distR="0" wp14:anchorId="4AD10686" wp14:editId="4766E268">
             <wp:extent cx="2228850" cy="4133850"/>
@@ -798,6 +874,7 @@
     </w:p>
     <w:p>
       <w:r>
+        <w:lastRenderedPageBreak/>
         <w:t xml:space="preserve">3. </w:t>
       </w:r>
     </w:p>
@@ -806,7 +883,6 @@
         <w:rPr>
           <w:noProof/>
         </w:rPr>
-        <w:lastRenderedPageBreak/>
         <w:drawing>
           <wp:inline distT="0" distB="0" distL="0" distR="0" wp14:anchorId="31BCC9E2" wp14:editId="593C4EBD">
             <wp:extent cx="3324225" cy="4324350"/>
@@ -923,6 +999,7 @@
     </w:p>
     <w:p>
       <w:r>
+        <w:lastRenderedPageBreak/>
         <w:t>GET_AVG_SALARY</w:t>
       </w:r>
       <w:r>
@@ -931,7 +1008,6 @@
     </w:p>
     <w:p>
       <w:r>
-        <w:lastRenderedPageBreak/>
         <w:t>GET_DARCZYNCY</w:t>
       </w:r>
       <w:r>
@@ -943,7 +1019,15 @@
         <w:t>GET_DAROWIZNY</w:t>
       </w:r>
       <w:r>
-        <w:t xml:space="preserve"> – Prosta funckja zwracająca dane z tabeli darowizny</w:t>
+        <w:t xml:space="preserve"> – Prosta </w:t>
+      </w:r>
+      <w:proofErr w:type="spellStart"/>
+      <w:r>
+        <w:t>funckja</w:t>
+      </w:r>
+      <w:proofErr w:type="spellEnd"/>
+      <w:r>
+        <w:t xml:space="preserve"> zwracająca dane z tabeli darowizny</w:t>
       </w:r>
     </w:p>
     <w:p>
@@ -951,7 +1035,15 @@
         <w:t>GET_FORMATTED_ADDRESSES – Funkcja agregująca dane z tabeli adresy</w:t>
       </w:r>
       <w:r>
-        <w:t>, mająca 2 pola – id adresu i polę łączące informacje dotyczące miejsca zamieszkania w zwięzły i czytelny sposób</w:t>
+        <w:t xml:space="preserve">, mająca 2 pola – id adresu i </w:t>
+      </w:r>
+      <w:proofErr w:type="spellStart"/>
+      <w:r>
+        <w:t>polę</w:t>
+      </w:r>
+      <w:proofErr w:type="spellEnd"/>
+      <w:r>
+        <w:t xml:space="preserve"> łączące informacje dotyczące miejsca zamieszkania w zwięzły i czytelny sposób</w:t>
       </w:r>
     </w:p>
     <w:p>
@@ -999,7 +1091,15 @@
         <w:t>GET_SUM_DONATIONS – Funkcja zwracają</w:t>
       </w:r>
       <w:r>
-        <w:t>ca sume wszystkich darowizn z bazy</w:t>
+        <w:t xml:space="preserve">ca </w:t>
+      </w:r>
+      <w:proofErr w:type="spellStart"/>
+      <w:r>
+        <w:t>sume</w:t>
+      </w:r>
+      <w:proofErr w:type="spellEnd"/>
+      <w:r>
+        <w:t xml:space="preserve"> wszystkich darowizn z bazy</w:t>
       </w:r>
     </w:p>
     <w:p>
@@ -1023,7 +1123,15 @@
         <w:t>POBIERZZWIERZETAPRACOWNICY</w:t>
       </w:r>
       <w:r>
-        <w:t xml:space="preserve"> – Funkcja zwracająca rozbudowane dane z tabeli wielu do wielu Pracownik_Zwierzęta, łączące dane z tabel Pracownicy i Zwierzęta w celu zwrócenia większej ilości szczegółów.</w:t>
+        <w:t xml:space="preserve"> – Funkcja zwracająca rozbudowane dane z tabeli wielu do wielu </w:t>
+      </w:r>
+      <w:proofErr w:type="spellStart"/>
+      <w:r>
+        <w:t>Pracownik_Zwierzęta</w:t>
+      </w:r>
+      <w:proofErr w:type="spellEnd"/>
+      <w:r>
+        <w:t>, łączące dane z tabel Pracownicy i Zwierzęta w celu zwrócenia większej ilości szczegółów.</w:t>
       </w:r>
     </w:p>
     <w:p/>
@@ -1074,6 +1182,508 @@
         </w:drawing>
       </w:r>
     </w:p>
+    <w:p/>
+    <w:p>
+      <w:pPr>
+        <w:pStyle w:val="Akapitzlist"/>
+        <w:numPr>
+          <w:ilvl w:val="0"/>
+          <w:numId w:val="11"/>
+        </w:numPr>
+        <w:rPr>
+          <w:b/>
+          <w:bCs/>
+          <w:sz w:val="48"/>
+          <w:szCs w:val="48"/>
+        </w:rPr>
+      </w:pPr>
+      <w:r>
+        <w:rPr>
+          <w:b/>
+          <w:bCs/>
+          <w:sz w:val="48"/>
+          <w:szCs w:val="48"/>
+        </w:rPr>
+        <w:lastRenderedPageBreak/>
+        <w:t>koncepcję dostępu zdalnego do bazy danych (jego założenia, planowane funkcjonalności)</w:t>
+      </w:r>
+    </w:p>
+    <w:p>
+      <w:r>
+        <w:t xml:space="preserve">Dostęp do bazy danych odbywa się poprzez serwer </w:t>
+      </w:r>
+      <w:r>
+        <w:rPr>
+          <w:u w:val="single"/>
+        </w:rPr>
+        <w:t>HTTP Apache</w:t>
+      </w:r>
+      <w:r>
+        <w:t xml:space="preserve">. Jest on uruchamiany poprzez </w:t>
+      </w:r>
+      <w:r>
+        <w:rPr>
+          <w:u w:val="single"/>
+        </w:rPr>
+        <w:t>XAMPP Control Panel v3.2.2.</w:t>
+      </w:r>
+      <w:r>
+        <w:t xml:space="preserve"> Następnie łączy się on z bazą danych</w:t>
+      </w:r>
+      <w:r>
+        <w:t xml:space="preserve"> Oracle</w:t>
+      </w:r>
+      <w:r>
+        <w:t xml:space="preserve"> </w:t>
+      </w:r>
+      <w:proofErr w:type="spellStart"/>
+      <w:r>
+        <w:t>znajdającą</w:t>
+      </w:r>
+      <w:proofErr w:type="spellEnd"/>
+      <w:r>
+        <w:t xml:space="preserve"> się w kontenerze </w:t>
+      </w:r>
+      <w:proofErr w:type="spellStart"/>
+      <w:r>
+        <w:rPr>
+          <w:u w:val="single"/>
+        </w:rPr>
+        <w:t>Dockera</w:t>
+      </w:r>
+      <w:proofErr w:type="spellEnd"/>
+      <w:r>
+        <w:rPr>
+          <w:u w:val="single"/>
+        </w:rPr>
+        <w:t>.</w:t>
+      </w:r>
+      <w:r>
+        <w:t xml:space="preserve"> </w:t>
+      </w:r>
+    </w:p>
+    <w:p>
+      <w:r>
+        <w:t>Funkcjonalności:</w:t>
+      </w:r>
+    </w:p>
+    <w:p>
+      <w:pPr>
+        <w:pStyle w:val="Akapitzlist"/>
+        <w:numPr>
+          <w:ilvl w:val="0"/>
+          <w:numId w:val="12"/>
+        </w:numPr>
+      </w:pPr>
+      <w:r>
+        <w:t>Przeglądanie zawartości każdej tabeli bazy danych.</w:t>
+      </w:r>
+    </w:p>
+    <w:p>
+      <w:pPr>
+        <w:pStyle w:val="Akapitzlist"/>
+        <w:numPr>
+          <w:ilvl w:val="0"/>
+          <w:numId w:val="12"/>
+        </w:numPr>
+      </w:pPr>
+      <w:r>
+        <w:t>Możliwość szybkiego dodawania, edytowania i usuwania rekordów.</w:t>
+      </w:r>
+    </w:p>
+    <w:p>
+      <w:pPr>
+        <w:pStyle w:val="Akapitzlist"/>
+        <w:numPr>
+          <w:ilvl w:val="0"/>
+          <w:numId w:val="12"/>
+        </w:numPr>
+      </w:pPr>
+      <w:r>
+        <w:t>Możliwość sortowania wyników według dowolnego atrybutu, rosnąco lub malejąco.</w:t>
+      </w:r>
+    </w:p>
+    <w:p>
+      <w:pPr>
+        <w:pStyle w:val="Akapitzlist"/>
+        <w:numPr>
+          <w:ilvl w:val="0"/>
+          <w:numId w:val="12"/>
+        </w:numPr>
+      </w:pPr>
+      <w:r>
+        <w:t>Możliwość znalezienia szukanego rekordu po wpisanej frazie.</w:t>
+      </w:r>
+    </w:p>
+    <w:p>
+      <w:pPr>
+        <w:pStyle w:val="Akapitzlist"/>
+        <w:numPr>
+          <w:ilvl w:val="0"/>
+          <w:numId w:val="12"/>
+        </w:numPr>
+      </w:pPr>
+      <w:r>
+        <w:t>Funkcja sumowania i znalezienia średniej z danych liczbowych, tj. z pensji pracowników, oraz z otrzymanych darowizn</w:t>
+      </w:r>
+    </w:p>
+    <w:p>
+      <w:pPr>
+        <w:pStyle w:val="Akapitzlist"/>
+        <w:numPr>
+          <w:ilvl w:val="0"/>
+          <w:numId w:val="12"/>
+        </w:numPr>
+      </w:pPr>
+      <w:r>
+        <w:t>Możliwość uzyskania zagregowanego widoku na koordynatorów adopcji, pokazujący ile każdy z nich ma podopiecznych.</w:t>
+      </w:r>
+    </w:p>
+    <w:p>
+      <w:pPr>
+        <w:pStyle w:val="Akapitzlist"/>
+        <w:rPr>
+          <w:sz w:val="36"/>
+          <w:szCs w:val="36"/>
+        </w:rPr>
+      </w:pPr>
+    </w:p>
+    <w:p>
+      <w:pPr>
+        <w:pStyle w:val="Akapitzlist"/>
+        <w:numPr>
+          <w:ilvl w:val="0"/>
+          <w:numId w:val="11"/>
+        </w:numPr>
+        <w:spacing w:after="200" w:line="276" w:lineRule="auto"/>
+        <w:jc w:val="both"/>
+        <w:rPr>
+          <w:b/>
+          <w:bCs/>
+        </w:rPr>
+      </w:pPr>
+      <w:r>
+        <w:rPr>
+          <w:b/>
+          <w:bCs/>
+          <w:sz w:val="48"/>
+          <w:szCs w:val="48"/>
+        </w:rPr>
+        <w:t>opis realizacji dostępu zdalnego do bazy danych wraz z jego prezentacją</w:t>
+      </w:r>
+      <w:r>
+        <w:rPr>
+          <w:b/>
+          <w:bCs/>
+        </w:rPr>
+        <w:t>.</w:t>
+      </w:r>
+    </w:p>
+    <w:p>
+      <w:pPr>
+        <w:pStyle w:val="Akapitzlist"/>
+        <w:spacing w:after="200" w:line="276" w:lineRule="auto"/>
+        <w:ind w:left="1080"/>
+        <w:jc w:val="both"/>
+        <w:rPr>
+          <w:b/>
+          <w:bCs/>
+          <w:sz w:val="48"/>
+          <w:szCs w:val="48"/>
+        </w:rPr>
+      </w:pPr>
+    </w:p>
+    <w:p>
+      <w:pPr>
+        <w:pStyle w:val="Akapitzlist"/>
+        <w:spacing w:after="200" w:line="276" w:lineRule="auto"/>
+        <w:ind w:left="1080"/>
+        <w:jc w:val="both"/>
+        <w:rPr>
+          <w:b/>
+          <w:bCs/>
+        </w:rPr>
+      </w:pPr>
+    </w:p>
+    <w:p>
+      <w:r>
+        <w:t>Proces użytkowania Bazy danych wygląda następująco:</w:t>
+      </w:r>
+    </w:p>
+    <w:p>
+      <w:pPr>
+        <w:pStyle w:val="Akapitzlist"/>
+        <w:numPr>
+          <w:ilvl w:val="0"/>
+          <w:numId w:val="13"/>
+        </w:numPr>
+      </w:pPr>
+      <w:r>
+        <w:t xml:space="preserve">Uruchamiamy </w:t>
+      </w:r>
+      <w:proofErr w:type="spellStart"/>
+      <w:r>
+        <w:t>Dockera</w:t>
+      </w:r>
+      <w:proofErr w:type="spellEnd"/>
+      <w:r>
+        <w:t>, klikamy przycisk startu naszego serwera</w:t>
+      </w:r>
+    </w:p>
+    <w:p>
+      <w:pPr>
+        <w:pStyle w:val="Akapitzlist"/>
+      </w:pPr>
+      <w:r>
+        <w:rPr>
+          <w:noProof/>
+        </w:rPr>
+        <w:drawing>
+          <wp:inline distT="0" distB="0" distL="0" distR="0" wp14:anchorId="6940873C" wp14:editId="6647782D">
+            <wp:extent cx="5760720" cy="1253490"/>
+            <wp:effectExtent l="0" t="0" r="0" b="3810"/>
+            <wp:docPr id="2060108113" name="Obraz 1" descr="Obraz zawierający tekst, Czcionka, oprogramowanie, zrzut ekranu&#10;&#10;Opis wygenerowany automatycznie"/>
+            <wp:cNvGraphicFramePr>
+              <a:graphicFrameLocks xmlns:a="http://schemas.openxmlformats.org/drawingml/2006/main" noChangeAspect="1"/>
+            </wp:cNvGraphicFramePr>
+            <a:graphic xmlns:a="http://schemas.openxmlformats.org/drawingml/2006/main">
+              <a:graphicData uri="http://schemas.openxmlformats.org/drawingml/2006/picture">
+                <pic:pic xmlns:pic="http://schemas.openxmlformats.org/drawingml/2006/picture">
+                  <pic:nvPicPr>
+                    <pic:cNvPr id="2060108113" name="Obraz 1" descr="Obraz zawierający tekst, Czcionka, oprogramowanie, zrzut ekranu&#10;&#10;Opis wygenerowany automatycznie"/>
+                    <pic:cNvPicPr/>
+                  </pic:nvPicPr>
+                  <pic:blipFill>
+                    <a:blip r:embed="rId11"/>
+                    <a:stretch>
+                      <a:fillRect/>
+                    </a:stretch>
+                  </pic:blipFill>
+                  <pic:spPr>
+                    <a:xfrm>
+                      <a:off x="0" y="0"/>
+                      <a:ext cx="5760720" cy="1253490"/>
+                    </a:xfrm>
+                    <a:prstGeom prst="rect">
+                      <a:avLst/>
+                    </a:prstGeom>
+                  </pic:spPr>
+                </pic:pic>
+              </a:graphicData>
+            </a:graphic>
+          </wp:inline>
+        </w:drawing>
+      </w:r>
+    </w:p>
+    <w:p>
+      <w:pPr>
+        <w:pStyle w:val="Akapitzlist"/>
+        <w:numPr>
+          <w:ilvl w:val="0"/>
+          <w:numId w:val="13"/>
+        </w:numPr>
+      </w:pPr>
+      <w:r>
+        <w:t>Uruchamiamy XAMPP, klikamy start serwera Apache</w:t>
+      </w:r>
+    </w:p>
+    <w:p>
+      <w:pPr>
+        <w:pStyle w:val="Akapitzlist"/>
+      </w:pPr>
+      <w:r>
+        <w:rPr>
+          <w:noProof/>
+        </w:rPr>
+        <w:lastRenderedPageBreak/>
+        <w:drawing>
+          <wp:inline distT="0" distB="0" distL="0" distR="0" wp14:anchorId="27B222EB" wp14:editId="7988330D">
+            <wp:extent cx="5760720" cy="3742055"/>
+            <wp:effectExtent l="0" t="0" r="0" b="0"/>
+            <wp:docPr id="1761622176" name="Obraz 1" descr="Obraz zawierający tekst, zrzut ekranu, oprogramowanie, Ikona komputerowa&#10;&#10;Opis wygenerowany automatycznie"/>
+            <wp:cNvGraphicFramePr>
+              <a:graphicFrameLocks xmlns:a="http://schemas.openxmlformats.org/drawingml/2006/main" noChangeAspect="1"/>
+            </wp:cNvGraphicFramePr>
+            <a:graphic xmlns:a="http://schemas.openxmlformats.org/drawingml/2006/main">
+              <a:graphicData uri="http://schemas.openxmlformats.org/drawingml/2006/picture">
+                <pic:pic xmlns:pic="http://schemas.openxmlformats.org/drawingml/2006/picture">
+                  <pic:nvPicPr>
+                    <pic:cNvPr id="1761622176" name="Obraz 1" descr="Obraz zawierający tekst, zrzut ekranu, oprogramowanie, Ikona komputerowa&#10;&#10;Opis wygenerowany automatycznie"/>
+                    <pic:cNvPicPr/>
+                  </pic:nvPicPr>
+                  <pic:blipFill>
+                    <a:blip r:embed="rId12"/>
+                    <a:stretch>
+                      <a:fillRect/>
+                    </a:stretch>
+                  </pic:blipFill>
+                  <pic:spPr>
+                    <a:xfrm>
+                      <a:off x="0" y="0"/>
+                      <a:ext cx="5760720" cy="3742055"/>
+                    </a:xfrm>
+                    <a:prstGeom prst="rect">
+                      <a:avLst/>
+                    </a:prstGeom>
+                  </pic:spPr>
+                </pic:pic>
+              </a:graphicData>
+            </a:graphic>
+          </wp:inline>
+        </w:drawing>
+      </w:r>
+    </w:p>
+    <w:p>
+      <w:pPr>
+        <w:pStyle w:val="Akapitzlist"/>
+        <w:numPr>
+          <w:ilvl w:val="0"/>
+          <w:numId w:val="13"/>
+        </w:numPr>
+      </w:pPr>
+      <w:r>
+        <w:t xml:space="preserve">Wchodzimy w przeglądarkę, wpisujemy frazę </w:t>
+      </w:r>
+      <w:proofErr w:type="spellStart"/>
+      <w:r>
+        <w:t>localhost</w:t>
+      </w:r>
+      <w:proofErr w:type="spellEnd"/>
+      <w:r>
+        <w:t>/</w:t>
+      </w:r>
+      <w:proofErr w:type="spellStart"/>
+      <w:r>
+        <w:t>animal-shelter</w:t>
+      </w:r>
+      <w:proofErr w:type="spellEnd"/>
+    </w:p>
+    <w:p>
+      <w:pPr>
+        <w:pStyle w:val="Akapitzlist"/>
+      </w:pPr>
+      <w:r>
+        <w:rPr>
+          <w:noProof/>
+        </w:rPr>
+        <w:drawing>
+          <wp:inline distT="0" distB="0" distL="0" distR="0" wp14:anchorId="1A1E08DC" wp14:editId="36B55B5A">
+            <wp:extent cx="4086225" cy="514350"/>
+            <wp:effectExtent l="0" t="0" r="9525" b="0"/>
+            <wp:docPr id="1065061167" name="Obraz 1" descr="Obraz zawierający Czcionka, tekst, zrzut ekranu, czarne&#10;&#10;Opis wygenerowany automatycznie"/>
+            <wp:cNvGraphicFramePr>
+              <a:graphicFrameLocks xmlns:a="http://schemas.openxmlformats.org/drawingml/2006/main" noChangeAspect="1"/>
+            </wp:cNvGraphicFramePr>
+            <a:graphic xmlns:a="http://schemas.openxmlformats.org/drawingml/2006/main">
+              <a:graphicData uri="http://schemas.openxmlformats.org/drawingml/2006/picture">
+                <pic:pic xmlns:pic="http://schemas.openxmlformats.org/drawingml/2006/picture">
+                  <pic:nvPicPr>
+                    <pic:cNvPr id="1065061167" name="Obraz 1" descr="Obraz zawierający Czcionka, tekst, zrzut ekranu, czarne&#10;&#10;Opis wygenerowany automatycznie"/>
+                    <pic:cNvPicPr/>
+                  </pic:nvPicPr>
+                  <pic:blipFill>
+                    <a:blip r:embed="rId13"/>
+                    <a:stretch>
+                      <a:fillRect/>
+                    </a:stretch>
+                  </pic:blipFill>
+                  <pic:spPr>
+                    <a:xfrm>
+                      <a:off x="0" y="0"/>
+                      <a:ext cx="4086225" cy="514350"/>
+                    </a:xfrm>
+                    <a:prstGeom prst="rect">
+                      <a:avLst/>
+                    </a:prstGeom>
+                  </pic:spPr>
+                </pic:pic>
+              </a:graphicData>
+            </a:graphic>
+          </wp:inline>
+        </w:drawing>
+      </w:r>
+    </w:p>
+    <w:p>
+      <w:pPr>
+        <w:pStyle w:val="Akapitzlist"/>
+        <w:numPr>
+          <w:ilvl w:val="0"/>
+          <w:numId w:val="13"/>
+        </w:numPr>
+      </w:pPr>
+      <w:r>
+        <w:t>Jesteśmy na serwerze. Po lewej stronie mamy wybór dostępnych tabel. Klikamy np. na Zwierzęta</w:t>
+      </w:r>
+    </w:p>
+    <w:p>
+      <w:pPr>
+        <w:pStyle w:val="Akapitzlist"/>
+      </w:pPr>
+      <w:r>
+        <w:rPr>
+          <w:noProof/>
+        </w:rPr>
+        <w:drawing>
+          <wp:inline distT="0" distB="0" distL="0" distR="0" wp14:anchorId="5FCF0192" wp14:editId="0F0620D0">
+            <wp:extent cx="5760720" cy="1729105"/>
+            <wp:effectExtent l="0" t="0" r="0" b="4445"/>
+            <wp:docPr id="1144720999" name="Obraz 1" descr="Obraz zawierający tekst, numer, Czcionka, linia&#10;&#10;Opis wygenerowany automatycznie"/>
+            <wp:cNvGraphicFramePr>
+              <a:graphicFrameLocks xmlns:a="http://schemas.openxmlformats.org/drawingml/2006/main" noChangeAspect="1"/>
+            </wp:cNvGraphicFramePr>
+            <a:graphic xmlns:a="http://schemas.openxmlformats.org/drawingml/2006/main">
+              <a:graphicData uri="http://schemas.openxmlformats.org/drawingml/2006/picture">
+                <pic:pic xmlns:pic="http://schemas.openxmlformats.org/drawingml/2006/picture">
+                  <pic:nvPicPr>
+                    <pic:cNvPr id="1144720999" name="Obraz 1" descr="Obraz zawierający tekst, numer, Czcionka, linia&#10;&#10;Opis wygenerowany automatycznie"/>
+                    <pic:cNvPicPr/>
+                  </pic:nvPicPr>
+                  <pic:blipFill>
+                    <a:blip r:embed="rId14"/>
+                    <a:stretch>
+                      <a:fillRect/>
+                    </a:stretch>
+                  </pic:blipFill>
+                  <pic:spPr>
+                    <a:xfrm>
+                      <a:off x="0" y="0"/>
+                      <a:ext cx="5760720" cy="1729105"/>
+                    </a:xfrm>
+                    <a:prstGeom prst="rect">
+                      <a:avLst/>
+                    </a:prstGeom>
+                  </pic:spPr>
+                </pic:pic>
+              </a:graphicData>
+            </a:graphic>
+          </wp:inline>
+        </w:drawing>
+      </w:r>
+    </w:p>
+    <w:p>
+      <w:pPr>
+        <w:pStyle w:val="Akapitzlist"/>
+      </w:pPr>
+      <w:r>
+        <w:t xml:space="preserve">Po prawej mamy opcję (kolejno) edycji i usuwania rekordów. Klikając na nazwy </w:t>
+      </w:r>
+      <w:proofErr w:type="spellStart"/>
+      <w:r>
+        <w:t>artrybutów</w:t>
+      </w:r>
+      <w:proofErr w:type="spellEnd"/>
+      <w:r>
+        <w:t xml:space="preserve"> możemy posortować wyniki. Wpisując w pasek „</w:t>
+      </w:r>
+      <w:proofErr w:type="spellStart"/>
+      <w:r>
+        <w:t>Search</w:t>
+      </w:r>
+      <w:proofErr w:type="spellEnd"/>
+      <w:r>
+        <w:t>” Możemy znaleźć interesujący nas wynik. Klikając w przycisk „Dodaj zwierzę” możemy dodać nowy rekord.</w:t>
+      </w:r>
+    </w:p>
     <w:sectPr>
       <w:pgSz w:w="11906" w:h="16838"/>
       <w:pgMar w:top="1417" w:right="1417" w:bottom="1417" w:left="1417" w:header="708" w:footer="708" w:gutter="0"/>
@@ -1534,6 +2144,95 @@
     </w:lvl>
   </w:abstractNum>
   <w:abstractNum w:abstractNumId="3" w15:restartNumberingAfterBreak="0">
+    <w:nsid w:val="482D1775"/>
+    <w:multiLevelType w:val="hybridMultilevel"/>
+    <w:tmpl w:val="F2ECC9CE"/>
+    <w:lvl w:ilvl="0" w:tplc="3A3EEB28">
+      <w:start w:val="1"/>
+      <w:numFmt w:val="upperLetter"/>
+      <w:lvlText w:val="%1)"/>
+      <w:lvlJc w:val="left"/>
+      <w:pPr>
+        <w:ind w:left="1080" w:hanging="720"/>
+      </w:pPr>
+      <w:rPr>
+        <w:rFonts w:hint="default"/>
+      </w:rPr>
+    </w:lvl>
+    <w:lvl w:ilvl="1" w:tplc="04150019" w:tentative="1">
+      <w:start w:val="1"/>
+      <w:numFmt w:val="lowerLetter"/>
+      <w:lvlText w:val="%2."/>
+      <w:lvlJc w:val="left"/>
+      <w:pPr>
+        <w:ind w:left="1440" w:hanging="360"/>
+      </w:pPr>
+    </w:lvl>
+    <w:lvl w:ilvl="2" w:tplc="0415001B" w:tentative="1">
+      <w:start w:val="1"/>
+      <w:numFmt w:val="lowerRoman"/>
+      <w:lvlText w:val="%3."/>
+      <w:lvlJc w:val="right"/>
+      <w:pPr>
+        <w:ind w:left="2160" w:hanging="180"/>
+      </w:pPr>
+    </w:lvl>
+    <w:lvl w:ilvl="3" w:tplc="0415000F" w:tentative="1">
+      <w:start w:val="1"/>
+      <w:numFmt w:val="decimal"/>
+      <w:lvlText w:val="%4."/>
+      <w:lvlJc w:val="left"/>
+      <w:pPr>
+        <w:ind w:left="2880" w:hanging="360"/>
+      </w:pPr>
+    </w:lvl>
+    <w:lvl w:ilvl="4" w:tplc="04150019" w:tentative="1">
+      <w:start w:val="1"/>
+      <w:numFmt w:val="lowerLetter"/>
+      <w:lvlText w:val="%5."/>
+      <w:lvlJc w:val="left"/>
+      <w:pPr>
+        <w:ind w:left="3600" w:hanging="360"/>
+      </w:pPr>
+    </w:lvl>
+    <w:lvl w:ilvl="5" w:tplc="0415001B" w:tentative="1">
+      <w:start w:val="1"/>
+      <w:numFmt w:val="lowerRoman"/>
+      <w:lvlText w:val="%6."/>
+      <w:lvlJc w:val="right"/>
+      <w:pPr>
+        <w:ind w:left="4320" w:hanging="180"/>
+      </w:pPr>
+    </w:lvl>
+    <w:lvl w:ilvl="6" w:tplc="0415000F" w:tentative="1">
+      <w:start w:val="1"/>
+      <w:numFmt w:val="decimal"/>
+      <w:lvlText w:val="%7."/>
+      <w:lvlJc w:val="left"/>
+      <w:pPr>
+        <w:ind w:left="5040" w:hanging="360"/>
+      </w:pPr>
+    </w:lvl>
+    <w:lvl w:ilvl="7" w:tplc="04150019" w:tentative="1">
+      <w:start w:val="1"/>
+      <w:numFmt w:val="lowerLetter"/>
+      <w:lvlText w:val="%8."/>
+      <w:lvlJc w:val="left"/>
+      <w:pPr>
+        <w:ind w:left="5760" w:hanging="360"/>
+      </w:pPr>
+    </w:lvl>
+    <w:lvl w:ilvl="8" w:tplc="0415001B" w:tentative="1">
+      <w:start w:val="1"/>
+      <w:numFmt w:val="lowerRoman"/>
+      <w:lvlText w:val="%9."/>
+      <w:lvlJc w:val="right"/>
+      <w:pPr>
+        <w:ind w:left="6480" w:hanging="180"/>
+      </w:pPr>
+    </w:lvl>
+  </w:abstractNum>
+  <w:abstractNum w:abstractNumId="4" w15:restartNumberingAfterBreak="0">
     <w:nsid w:val="4B9B4882"/>
     <w:multiLevelType w:val="multilevel"/>
     <w:tmpl w:val="4FF2864E"/>
@@ -1674,7 +2373,7 @@
       </w:rPr>
     </w:lvl>
   </w:abstractNum>
-  <w:abstractNum w:abstractNumId="4" w15:restartNumberingAfterBreak="0">
+  <w:abstractNum w:abstractNumId="5" w15:restartNumberingAfterBreak="0">
     <w:nsid w:val="4EA423EB"/>
     <w:multiLevelType w:val="multilevel"/>
     <w:tmpl w:val="6F3CC060"/>
@@ -1823,7 +2522,364 @@
       </w:rPr>
     </w:lvl>
   </w:abstractNum>
-  <w:abstractNum w:abstractNumId="5" w15:restartNumberingAfterBreak="0">
+  <w:abstractNum w:abstractNumId="6" w15:restartNumberingAfterBreak="0">
+    <w:nsid w:val="563C0809"/>
+    <w:multiLevelType w:val="hybridMultilevel"/>
+    <w:tmpl w:val="CC60FCC4"/>
+    <w:lvl w:ilvl="0" w:tplc="0415000F">
+      <w:start w:val="1"/>
+      <w:numFmt w:val="decimal"/>
+      <w:lvlText w:val="%1."/>
+      <w:lvlJc w:val="left"/>
+      <w:pPr>
+        <w:ind w:left="720" w:hanging="360"/>
+      </w:pPr>
+    </w:lvl>
+    <w:lvl w:ilvl="1" w:tplc="04150019" w:tentative="1">
+      <w:start w:val="1"/>
+      <w:numFmt w:val="lowerLetter"/>
+      <w:lvlText w:val="%2."/>
+      <w:lvlJc w:val="left"/>
+      <w:pPr>
+        <w:ind w:left="1440" w:hanging="360"/>
+      </w:pPr>
+    </w:lvl>
+    <w:lvl w:ilvl="2" w:tplc="0415001B" w:tentative="1">
+      <w:start w:val="1"/>
+      <w:numFmt w:val="lowerRoman"/>
+      <w:lvlText w:val="%3."/>
+      <w:lvlJc w:val="right"/>
+      <w:pPr>
+        <w:ind w:left="2160" w:hanging="180"/>
+      </w:pPr>
+    </w:lvl>
+    <w:lvl w:ilvl="3" w:tplc="0415000F" w:tentative="1">
+      <w:start w:val="1"/>
+      <w:numFmt w:val="decimal"/>
+      <w:lvlText w:val="%4."/>
+      <w:lvlJc w:val="left"/>
+      <w:pPr>
+        <w:ind w:left="2880" w:hanging="360"/>
+      </w:pPr>
+    </w:lvl>
+    <w:lvl w:ilvl="4" w:tplc="04150019" w:tentative="1">
+      <w:start w:val="1"/>
+      <w:numFmt w:val="lowerLetter"/>
+      <w:lvlText w:val="%5."/>
+      <w:lvlJc w:val="left"/>
+      <w:pPr>
+        <w:ind w:left="3600" w:hanging="360"/>
+      </w:pPr>
+    </w:lvl>
+    <w:lvl w:ilvl="5" w:tplc="0415001B" w:tentative="1">
+      <w:start w:val="1"/>
+      <w:numFmt w:val="lowerRoman"/>
+      <w:lvlText w:val="%6."/>
+      <w:lvlJc w:val="right"/>
+      <w:pPr>
+        <w:ind w:left="4320" w:hanging="180"/>
+      </w:pPr>
+    </w:lvl>
+    <w:lvl w:ilvl="6" w:tplc="0415000F" w:tentative="1">
+      <w:start w:val="1"/>
+      <w:numFmt w:val="decimal"/>
+      <w:lvlText w:val="%7."/>
+      <w:lvlJc w:val="left"/>
+      <w:pPr>
+        <w:ind w:left="5040" w:hanging="360"/>
+      </w:pPr>
+    </w:lvl>
+    <w:lvl w:ilvl="7" w:tplc="04150019" w:tentative="1">
+      <w:start w:val="1"/>
+      <w:numFmt w:val="lowerLetter"/>
+      <w:lvlText w:val="%8."/>
+      <w:lvlJc w:val="left"/>
+      <w:pPr>
+        <w:ind w:left="5760" w:hanging="360"/>
+      </w:pPr>
+    </w:lvl>
+    <w:lvl w:ilvl="8" w:tplc="0415001B" w:tentative="1">
+      <w:start w:val="1"/>
+      <w:numFmt w:val="lowerRoman"/>
+      <w:lvlText w:val="%9."/>
+      <w:lvlJc w:val="right"/>
+      <w:pPr>
+        <w:ind w:left="6480" w:hanging="180"/>
+      </w:pPr>
+    </w:lvl>
+  </w:abstractNum>
+  <w:abstractNum w:abstractNumId="7" w15:restartNumberingAfterBreak="0">
+    <w:nsid w:val="5E3A33A9"/>
+    <w:multiLevelType w:val="hybridMultilevel"/>
+    <w:tmpl w:val="6FDEF9C6"/>
+    <w:lvl w:ilvl="0" w:tplc="817E3068">
+      <w:start w:val="1"/>
+      <w:numFmt w:val="upperLetter"/>
+      <w:lvlText w:val="%1)"/>
+      <w:lvlJc w:val="left"/>
+      <w:pPr>
+        <w:ind w:left="1080" w:hanging="720"/>
+      </w:pPr>
+      <w:rPr>
+        <w:rFonts w:hint="default"/>
+      </w:rPr>
+    </w:lvl>
+    <w:lvl w:ilvl="1" w:tplc="04150019" w:tentative="1">
+      <w:start w:val="1"/>
+      <w:numFmt w:val="lowerLetter"/>
+      <w:lvlText w:val="%2."/>
+      <w:lvlJc w:val="left"/>
+      <w:pPr>
+        <w:ind w:left="1440" w:hanging="360"/>
+      </w:pPr>
+    </w:lvl>
+    <w:lvl w:ilvl="2" w:tplc="0415001B" w:tentative="1">
+      <w:start w:val="1"/>
+      <w:numFmt w:val="lowerRoman"/>
+      <w:lvlText w:val="%3."/>
+      <w:lvlJc w:val="right"/>
+      <w:pPr>
+        <w:ind w:left="2160" w:hanging="180"/>
+      </w:pPr>
+    </w:lvl>
+    <w:lvl w:ilvl="3" w:tplc="0415000F" w:tentative="1">
+      <w:start w:val="1"/>
+      <w:numFmt w:val="decimal"/>
+      <w:lvlText w:val="%4."/>
+      <w:lvlJc w:val="left"/>
+      <w:pPr>
+        <w:ind w:left="2880" w:hanging="360"/>
+      </w:pPr>
+    </w:lvl>
+    <w:lvl w:ilvl="4" w:tplc="04150019" w:tentative="1">
+      <w:start w:val="1"/>
+      <w:numFmt w:val="lowerLetter"/>
+      <w:lvlText w:val="%5."/>
+      <w:lvlJc w:val="left"/>
+      <w:pPr>
+        <w:ind w:left="3600" w:hanging="360"/>
+      </w:pPr>
+    </w:lvl>
+    <w:lvl w:ilvl="5" w:tplc="0415001B" w:tentative="1">
+      <w:start w:val="1"/>
+      <w:numFmt w:val="lowerRoman"/>
+      <w:lvlText w:val="%6."/>
+      <w:lvlJc w:val="right"/>
+      <w:pPr>
+        <w:ind w:left="4320" w:hanging="180"/>
+      </w:pPr>
+    </w:lvl>
+    <w:lvl w:ilvl="6" w:tplc="0415000F" w:tentative="1">
+      <w:start w:val="1"/>
+      <w:numFmt w:val="decimal"/>
+      <w:lvlText w:val="%7."/>
+      <w:lvlJc w:val="left"/>
+      <w:pPr>
+        <w:ind w:left="5040" w:hanging="360"/>
+      </w:pPr>
+    </w:lvl>
+    <w:lvl w:ilvl="7" w:tplc="04150019" w:tentative="1">
+      <w:start w:val="1"/>
+      <w:numFmt w:val="lowerLetter"/>
+      <w:lvlText w:val="%8."/>
+      <w:lvlJc w:val="left"/>
+      <w:pPr>
+        <w:ind w:left="5760" w:hanging="360"/>
+      </w:pPr>
+    </w:lvl>
+    <w:lvl w:ilvl="8" w:tplc="0415001B" w:tentative="1">
+      <w:start w:val="1"/>
+      <w:numFmt w:val="lowerRoman"/>
+      <w:lvlText w:val="%9."/>
+      <w:lvlJc w:val="right"/>
+      <w:pPr>
+        <w:ind w:left="6480" w:hanging="180"/>
+      </w:pPr>
+    </w:lvl>
+  </w:abstractNum>
+  <w:abstractNum w:abstractNumId="8" w15:restartNumberingAfterBreak="0">
+    <w:nsid w:val="652515EA"/>
+    <w:multiLevelType w:val="hybridMultilevel"/>
+    <w:tmpl w:val="B11649BA"/>
+    <w:lvl w:ilvl="0" w:tplc="CCF2E54A">
+      <w:start w:val="1"/>
+      <w:numFmt w:val="upperLetter"/>
+      <w:lvlText w:val="%1)"/>
+      <w:lvlJc w:val="left"/>
+      <w:pPr>
+        <w:ind w:left="1080" w:hanging="720"/>
+      </w:pPr>
+      <w:rPr>
+        <w:rFonts w:hint="default"/>
+        <w:b/>
+        <w:bCs/>
+        <w:sz w:val="48"/>
+        <w:szCs w:val="48"/>
+      </w:rPr>
+    </w:lvl>
+    <w:lvl w:ilvl="1" w:tplc="04150019" w:tentative="1">
+      <w:start w:val="1"/>
+      <w:numFmt w:val="lowerLetter"/>
+      <w:lvlText w:val="%2."/>
+      <w:lvlJc w:val="left"/>
+      <w:pPr>
+        <w:ind w:left="1440" w:hanging="360"/>
+      </w:pPr>
+    </w:lvl>
+    <w:lvl w:ilvl="2" w:tplc="0415001B" w:tentative="1">
+      <w:start w:val="1"/>
+      <w:numFmt w:val="lowerRoman"/>
+      <w:lvlText w:val="%3."/>
+      <w:lvlJc w:val="right"/>
+      <w:pPr>
+        <w:ind w:left="2160" w:hanging="180"/>
+      </w:pPr>
+    </w:lvl>
+    <w:lvl w:ilvl="3" w:tplc="0415000F" w:tentative="1">
+      <w:start w:val="1"/>
+      <w:numFmt w:val="decimal"/>
+      <w:lvlText w:val="%4."/>
+      <w:lvlJc w:val="left"/>
+      <w:pPr>
+        <w:ind w:left="2880" w:hanging="360"/>
+      </w:pPr>
+    </w:lvl>
+    <w:lvl w:ilvl="4" w:tplc="04150019" w:tentative="1">
+      <w:start w:val="1"/>
+      <w:numFmt w:val="lowerLetter"/>
+      <w:lvlText w:val="%5."/>
+      <w:lvlJc w:val="left"/>
+      <w:pPr>
+        <w:ind w:left="3600" w:hanging="360"/>
+      </w:pPr>
+    </w:lvl>
+    <w:lvl w:ilvl="5" w:tplc="0415001B" w:tentative="1">
+      <w:start w:val="1"/>
+      <w:numFmt w:val="lowerRoman"/>
+      <w:lvlText w:val="%6."/>
+      <w:lvlJc w:val="right"/>
+      <w:pPr>
+        <w:ind w:left="4320" w:hanging="180"/>
+      </w:pPr>
+    </w:lvl>
+    <w:lvl w:ilvl="6" w:tplc="0415000F" w:tentative="1">
+      <w:start w:val="1"/>
+      <w:numFmt w:val="decimal"/>
+      <w:lvlText w:val="%7."/>
+      <w:lvlJc w:val="left"/>
+      <w:pPr>
+        <w:ind w:left="5040" w:hanging="360"/>
+      </w:pPr>
+    </w:lvl>
+    <w:lvl w:ilvl="7" w:tplc="04150019" w:tentative="1">
+      <w:start w:val="1"/>
+      <w:numFmt w:val="lowerLetter"/>
+      <w:lvlText w:val="%8."/>
+      <w:lvlJc w:val="left"/>
+      <w:pPr>
+        <w:ind w:left="5760" w:hanging="360"/>
+      </w:pPr>
+    </w:lvl>
+    <w:lvl w:ilvl="8" w:tplc="0415001B" w:tentative="1">
+      <w:start w:val="1"/>
+      <w:numFmt w:val="lowerRoman"/>
+      <w:lvlText w:val="%9."/>
+      <w:lvlJc w:val="right"/>
+      <w:pPr>
+        <w:ind w:left="6480" w:hanging="180"/>
+      </w:pPr>
+    </w:lvl>
+  </w:abstractNum>
+  <w:abstractNum w:abstractNumId="9" w15:restartNumberingAfterBreak="0">
+    <w:nsid w:val="72126EA6"/>
+    <w:multiLevelType w:val="hybridMultilevel"/>
+    <w:tmpl w:val="470CF590"/>
+    <w:lvl w:ilvl="0" w:tplc="0415000F">
+      <w:start w:val="1"/>
+      <w:numFmt w:val="decimal"/>
+      <w:lvlText w:val="%1."/>
+      <w:lvlJc w:val="left"/>
+      <w:pPr>
+        <w:ind w:left="720" w:hanging="360"/>
+      </w:pPr>
+      <w:rPr>
+        <w:rFonts w:hint="default"/>
+      </w:rPr>
+    </w:lvl>
+    <w:lvl w:ilvl="1" w:tplc="04150019">
+      <w:start w:val="1"/>
+      <w:numFmt w:val="lowerLetter"/>
+      <w:lvlText w:val="%2."/>
+      <w:lvlJc w:val="left"/>
+      <w:pPr>
+        <w:ind w:left="1440" w:hanging="360"/>
+      </w:pPr>
+    </w:lvl>
+    <w:lvl w:ilvl="2" w:tplc="0415001B">
+      <w:start w:val="1"/>
+      <w:numFmt w:val="lowerRoman"/>
+      <w:lvlText w:val="%3."/>
+      <w:lvlJc w:val="right"/>
+      <w:pPr>
+        <w:ind w:left="2160" w:hanging="180"/>
+      </w:pPr>
+    </w:lvl>
+    <w:lvl w:ilvl="3" w:tplc="0415000F">
+      <w:start w:val="1"/>
+      <w:numFmt w:val="decimal"/>
+      <w:lvlText w:val="%4."/>
+      <w:lvlJc w:val="left"/>
+      <w:pPr>
+        <w:ind w:left="2880" w:hanging="360"/>
+      </w:pPr>
+    </w:lvl>
+    <w:lvl w:ilvl="4" w:tplc="04150019" w:tentative="1">
+      <w:start w:val="1"/>
+      <w:numFmt w:val="lowerLetter"/>
+      <w:lvlText w:val="%5."/>
+      <w:lvlJc w:val="left"/>
+      <w:pPr>
+        <w:ind w:left="3600" w:hanging="360"/>
+      </w:pPr>
+    </w:lvl>
+    <w:lvl w:ilvl="5" w:tplc="0415001B" w:tentative="1">
+      <w:start w:val="1"/>
+      <w:numFmt w:val="lowerRoman"/>
+      <w:lvlText w:val="%6."/>
+      <w:lvlJc w:val="right"/>
+      <w:pPr>
+        <w:ind w:left="4320" w:hanging="180"/>
+      </w:pPr>
+    </w:lvl>
+    <w:lvl w:ilvl="6" w:tplc="0415000F" w:tentative="1">
+      <w:start w:val="1"/>
+      <w:numFmt w:val="decimal"/>
+      <w:lvlText w:val="%7."/>
+      <w:lvlJc w:val="left"/>
+      <w:pPr>
+        <w:ind w:left="5040" w:hanging="360"/>
+      </w:pPr>
+    </w:lvl>
+    <w:lvl w:ilvl="7" w:tplc="04150019" w:tentative="1">
+      <w:start w:val="1"/>
+      <w:numFmt w:val="lowerLetter"/>
+      <w:lvlText w:val="%8."/>
+      <w:lvlJc w:val="left"/>
+      <w:pPr>
+        <w:ind w:left="5760" w:hanging="360"/>
+      </w:pPr>
+    </w:lvl>
+    <w:lvl w:ilvl="8" w:tplc="0415001B" w:tentative="1">
+      <w:start w:val="1"/>
+      <w:numFmt w:val="lowerRoman"/>
+      <w:lvlText w:val="%9."/>
+      <w:lvlJc w:val="right"/>
+      <w:pPr>
+        <w:ind w:left="6480" w:hanging="180"/>
+      </w:pPr>
+    </w:lvl>
+  </w:abstractNum>
+  <w:abstractNum w:abstractNumId="10" w15:restartNumberingAfterBreak="0">
     <w:nsid w:val="73AA1D07"/>
     <w:multiLevelType w:val="multilevel"/>
     <w:tmpl w:val="7BDE5D22"/>
@@ -1972,7 +3028,7 @@
       </w:rPr>
     </w:lvl>
   </w:abstractNum>
-  <w:abstractNum w:abstractNumId="6" w15:restartNumberingAfterBreak="0">
+  <w:abstractNum w:abstractNumId="11" w15:restartNumberingAfterBreak="0">
     <w:nsid w:val="75867594"/>
     <w:multiLevelType w:val="hybridMultilevel"/>
     <w:tmpl w:val="7A1C0A04"/>
@@ -2058,7 +3114,7 @@
       </w:pPr>
     </w:lvl>
   </w:abstractNum>
-  <w:abstractNum w:abstractNumId="7" w15:restartNumberingAfterBreak="0">
+  <w:abstractNum w:abstractNumId="12" w15:restartNumberingAfterBreak="0">
     <w:nsid w:val="796607E8"/>
     <w:multiLevelType w:val="multilevel"/>
     <w:tmpl w:val="F0B4A8F6"/>
@@ -2211,25 +3267,25 @@
     <w:abstractNumId w:val="1"/>
   </w:num>
   <w:num w:numId="2" w16cid:durableId="1107501099">
-    <w:abstractNumId w:val="7"/>
+    <w:abstractNumId w:val="12"/>
   </w:num>
   <w:num w:numId="3" w16cid:durableId="25759975">
     <w:abstractNumId w:val="2"/>
   </w:num>
   <w:num w:numId="4" w16cid:durableId="1759406790">
-    <w:abstractNumId w:val="4"/>
+    <w:abstractNumId w:val="5"/>
   </w:num>
   <w:num w:numId="5" w16cid:durableId="957956600">
-    <w:abstractNumId w:val="5"/>
+    <w:abstractNumId w:val="10"/>
   </w:num>
   <w:num w:numId="6" w16cid:durableId="1252087417">
-    <w:abstractNumId w:val="3"/>
+    <w:abstractNumId w:val="4"/>
   </w:num>
   <w:num w:numId="7" w16cid:durableId="1435202488">
     <w:abstractNumId w:val="0"/>
   </w:num>
   <w:num w:numId="8" w16cid:durableId="1379088145">
-    <w:abstractNumId w:val="6"/>
+    <w:abstractNumId w:val="11"/>
     <w:lvlOverride w:ilvl="0">
       <w:startOverride w:val="1"/>
     </w:lvlOverride>
@@ -2257,6 +3313,21 @@
     <w:lvlOverride w:ilvl="8">
       <w:startOverride w:val="1"/>
     </w:lvlOverride>
+  </w:num>
+  <w:num w:numId="9" w16cid:durableId="306280846">
+    <w:abstractNumId w:val="3"/>
+  </w:num>
+  <w:num w:numId="10" w16cid:durableId="846136087">
+    <w:abstractNumId w:val="7"/>
+  </w:num>
+  <w:num w:numId="11" w16cid:durableId="305208371">
+    <w:abstractNumId w:val="8"/>
+  </w:num>
+  <w:num w:numId="12" w16cid:durableId="891232058">
+    <w:abstractNumId w:val="9"/>
+  </w:num>
+  <w:num w:numId="13" w16cid:durableId="1167794203">
+    <w:abstractNumId w:val="6"/>
   </w:num>
 </w:numbering>
 </file>
@@ -2661,7 +3732,7 @@
   <w:style w:type="paragraph" w:default="1" w:styleId="Normalny">
     <w:name w:val="Normal"/>
     <w:qFormat/>
-    <w:rsid w:val="007E7043"/>
+    <w:rsid w:val="00AF1F41"/>
   </w:style>
   <w:style w:type="paragraph" w:styleId="Nagwek1">
     <w:name w:val="heading 1"/>
@@ -2865,7 +3936,6 @@
   <w:style w:type="character" w:default="1" w:styleId="Domylnaczcionkaakapitu">
     <w:name w:val="Default Paragraph Font"/>
     <w:uiPriority w:val="1"/>
-    <w:semiHidden/>
     <w:unhideWhenUsed/>
   </w:style>
   <w:style w:type="table" w:default="1" w:styleId="Standardowy">

</xml_diff>

<commit_message>
poprawki dokumentacji + polskie znaki w sql
</commit_message>
<xml_diff>
--- a/Dokumentacja_projekt.docx
+++ b/Dokumentacja_projekt.docx
@@ -301,7 +301,7 @@
       </w:r>
       <w:proofErr w:type="spellStart"/>
       <w:r>
-        <w:t>osoba_adoptujaca_id</w:t>
+        <w:t>zwierzak_id</w:t>
       </w:r>
       <w:proofErr w:type="spellEnd"/>
       <w:r>
@@ -309,10 +309,16 @@
       </w:r>
       <w:proofErr w:type="spellStart"/>
       <w:r>
-        <w:t>zwierzak_id</w:t>
+        <w:rPr>
+          <w:u w:val="single"/>
+        </w:rPr>
+        <w:t>pracownik_id</w:t>
       </w:r>
       <w:proofErr w:type="spellEnd"/>
       <w:r>
+        <w:rPr>
+          <w:u w:val="single"/>
+        </w:rPr>
         <w:t xml:space="preserve">, </w:t>
       </w:r>
       <w:proofErr w:type="spellStart"/>
@@ -320,41 +326,37 @@
         <w:rPr>
           <w:u w:val="single"/>
         </w:rPr>
-        <w:t>pracownik_id</w:t>
+        <w:t>imie</w:t>
       </w:r>
       <w:proofErr w:type="spellEnd"/>
       <w:r>
-        <w:t>) </w:t>
-      </w:r>
-    </w:p>
-    <w:p>
-      <w:pPr>
-        <w:numPr>
-          <w:ilvl w:val="0"/>
-          <w:numId w:val="5"/>
-        </w:numPr>
-      </w:pPr>
-      <w:r>
-        <w:rPr>
-          <w:b/>
-          <w:bCs/>
-        </w:rPr>
-        <w:t>Osoby adoptujące</w:t>
-      </w:r>
-      <w:r>
-        <w:t xml:space="preserve"> (</w:t>
+        <w:rPr>
+          <w:u w:val="single"/>
+        </w:rPr>
+        <w:t xml:space="preserve">, nazwisko, </w:t>
       </w:r>
       <w:proofErr w:type="spellStart"/>
       <w:r>
-        <w:t>adopter_id</w:t>
+        <w:rPr>
+          <w:u w:val="single"/>
+        </w:rPr>
+        <w:t>adres_id</w:t>
       </w:r>
       <w:proofErr w:type="spellEnd"/>
       <w:r>
-        <w:t xml:space="preserve">, imię, nazwisko, adres, </w:t>
-      </w:r>
-      <w:r>
-        <w:t>telefon</w:t>
-      </w:r>
+        <w:rPr>
+          <w:u w:val="single"/>
+        </w:rPr>
+        <w:t xml:space="preserve">, </w:t>
+      </w:r>
+      <w:proofErr w:type="spellStart"/>
+      <w:r>
+        <w:rPr>
+          <w:u w:val="single"/>
+        </w:rPr>
+        <w:t>numer_telefonu</w:t>
+      </w:r>
+      <w:proofErr w:type="spellEnd"/>
       <w:r>
         <w:t>) </w:t>
       </w:r>
@@ -405,7 +407,14 @@
           <w:b/>
           <w:bCs/>
         </w:rPr>
-        <w:t>Osoby darczyńcy</w:t>
+        <w:t>D</w:t>
+      </w:r>
+      <w:r>
+        <w:rPr>
+          <w:b/>
+          <w:bCs/>
+        </w:rPr>
+        <w:t>arczyńcy</w:t>
       </w:r>
       <w:r>
         <w:t xml:space="preserve"> (</w:t>
@@ -434,10 +443,10 @@
         </w:rPr>
         <w:lastRenderedPageBreak/>
         <w:drawing>
-          <wp:inline distT="0" distB="0" distL="0" distR="0" wp14:anchorId="22D3FC14" wp14:editId="0F07A5E4">
-            <wp:extent cx="5760720" cy="3153410"/>
-            <wp:effectExtent l="0" t="0" r="0" b="8890"/>
-            <wp:docPr id="1643318062" name="Obraz 1" descr="Obraz zawierający tekst, zrzut ekranu, Czcionka, Równolegle&#10;&#10;Opis wygenerowany automatycznie"/>
+          <wp:inline distT="0" distB="0" distL="0" distR="0" wp14:anchorId="1AE91198" wp14:editId="61CE6734">
+            <wp:extent cx="6472118" cy="3841750"/>
+            <wp:effectExtent l="0" t="0" r="5080" b="6350"/>
+            <wp:docPr id="1184198739" name="Obraz 1" descr="Obraz zawierający tekst, zrzut ekranu, diagram&#10;&#10;Opis wygenerowany automatycznie"/>
             <wp:cNvGraphicFramePr>
               <a:graphicFrameLocks xmlns:a="http://schemas.openxmlformats.org/drawingml/2006/main" noChangeAspect="1"/>
             </wp:cNvGraphicFramePr>
@@ -445,7 +454,7 @@
               <a:graphicData uri="http://schemas.openxmlformats.org/drawingml/2006/picture">
                 <pic:pic xmlns:pic="http://schemas.openxmlformats.org/drawingml/2006/picture">
                   <pic:nvPicPr>
-                    <pic:cNvPr id="1643318062" name="Obraz 1" descr="Obraz zawierający tekst, zrzut ekranu, Czcionka, Równolegle&#10;&#10;Opis wygenerowany automatycznie"/>
+                    <pic:cNvPr id="1184198739" name="Obraz 1" descr="Obraz zawierający tekst, zrzut ekranu, diagram&#10;&#10;Opis wygenerowany automatycznie"/>
                     <pic:cNvPicPr/>
                   </pic:nvPicPr>
                   <pic:blipFill>
@@ -457,7 +466,7 @@
                   <pic:spPr>
                     <a:xfrm>
                       <a:off x="0" y="0"/>
-                      <a:ext cx="5760720" cy="3153410"/>
+                      <a:ext cx="6478428" cy="3845496"/>
                     </a:xfrm>
                     <a:prstGeom prst="rect">
                       <a:avLst/>
@@ -470,19 +479,6 @@
         </w:drawing>
       </w:r>
     </w:p>
-    <w:p>
-      <w:pPr>
-        <w:rPr>
-          <w:u w:val="single"/>
-        </w:rPr>
-      </w:pPr>
-      <w:r>
-        <w:rPr>
-          <w:u w:val="single"/>
-        </w:rPr>
-        <w:t>(Wersja nie ostateczna)</w:t>
-      </w:r>
-    </w:p>
     <w:p/>
     <w:p>
       <w:pPr>
@@ -638,79 +634,12 @@
       </w:r>
     </w:p>
     <w:p>
-      <w:r>
-        <w:t xml:space="preserve">Ostateczny schemat ERD bazy uległ zmianie. Podjęto decyzję o likwidacji tabeli </w:t>
-      </w:r>
-      <w:proofErr w:type="spellStart"/>
-      <w:r>
-        <w:rPr>
-          <w:u w:val="single"/>
-        </w:rPr>
-        <w:t>Osoby_adoptujące</w:t>
-      </w:r>
-      <w:proofErr w:type="spellEnd"/>
-      <w:r>
-        <w:t xml:space="preserve">, jako że ilość danych w niej zawarta była bardzo ograniczona. Dane zawarte w tej tabeli zostały zawarte bezpośrednio w tabeli </w:t>
-      </w:r>
-      <w:proofErr w:type="spellStart"/>
-      <w:r>
-        <w:rPr>
-          <w:u w:val="single"/>
-        </w:rPr>
-        <w:t>Rejestr_adopcji</w:t>
-      </w:r>
-      <w:proofErr w:type="spellEnd"/>
-      <w:r>
-        <w:t>.</w:t>
-      </w:r>
-    </w:p>
-    <w:p>
       <w:pPr>
         <w:rPr>
           <w:sz w:val="36"/>
           <w:szCs w:val="36"/>
         </w:rPr>
       </w:pPr>
-      <w:r>
-        <w:rPr>
-          <w:noProof/>
-        </w:rPr>
-        <w:drawing>
-          <wp:inline distT="0" distB="0" distL="0" distR="0" wp14:anchorId="3E9E4CFA" wp14:editId="3973F152">
-            <wp:extent cx="5760720" cy="3768090"/>
-            <wp:effectExtent l="0" t="0" r="0" b="3810"/>
-            <wp:docPr id="1615453530" name="Obraz 1" descr="Obraz zawierający tekst, zrzut ekranu, Czcionka, Równolegle&#10;&#10;Opis wygenerowany automatycznie"/>
-            <wp:cNvGraphicFramePr>
-              <a:graphicFrameLocks xmlns:a="http://schemas.openxmlformats.org/drawingml/2006/main" noChangeAspect="1"/>
-            </wp:cNvGraphicFramePr>
-            <a:graphic xmlns:a="http://schemas.openxmlformats.org/drawingml/2006/main">
-              <a:graphicData uri="http://schemas.openxmlformats.org/drawingml/2006/picture">
-                <pic:pic xmlns:pic="http://schemas.openxmlformats.org/drawingml/2006/picture">
-                  <pic:nvPicPr>
-                    <pic:cNvPr id="1615453530" name="Obraz 1" descr="Obraz zawierający tekst, zrzut ekranu, Czcionka, Równolegle&#10;&#10;Opis wygenerowany automatycznie"/>
-                    <pic:cNvPicPr/>
-                  </pic:nvPicPr>
-                  <pic:blipFill>
-                    <a:blip r:embed="rId6"/>
-                    <a:stretch>
-                      <a:fillRect/>
-                    </a:stretch>
-                  </pic:blipFill>
-                  <pic:spPr>
-                    <a:xfrm>
-                      <a:off x="0" y="0"/>
-                      <a:ext cx="5760720" cy="3768090"/>
-                    </a:xfrm>
-                    <a:prstGeom prst="rect">
-                      <a:avLst/>
-                    </a:prstGeom>
-                  </pic:spPr>
-                </pic:pic>
-              </a:graphicData>
-            </a:graphic>
-          </wp:inline>
-        </w:drawing>
-      </w:r>
     </w:p>
     <w:p>
       <w:pPr>
@@ -761,7 +690,6 @@
         <w:rPr>
           <w:noProof/>
         </w:rPr>
-        <w:lastRenderedPageBreak/>
         <w:drawing>
           <wp:inline distT="0" distB="0" distL="0" distR="0" wp14:anchorId="532B7C92" wp14:editId="3AD9C55B">
             <wp:extent cx="2447925" cy="2838450"/>
@@ -778,7 +706,7 @@
                     <pic:cNvPicPr/>
                   </pic:nvPicPr>
                   <pic:blipFill>
-                    <a:blip r:embed="rId7"/>
+                    <a:blip r:embed="rId6"/>
                     <a:stretch>
                       <a:fillRect/>
                     </a:stretch>
@@ -817,6 +745,7 @@
         <w:rPr>
           <w:noProof/>
         </w:rPr>
+        <w:lastRenderedPageBreak/>
         <w:drawing>
           <wp:inline distT="0" distB="0" distL="0" distR="0" wp14:anchorId="4AD10686" wp14:editId="4766E268">
             <wp:extent cx="2228850" cy="4133850"/>
@@ -833,7 +762,7 @@
                     <pic:cNvPicPr/>
                   </pic:nvPicPr>
                   <pic:blipFill>
-                    <a:blip r:embed="rId8"/>
+                    <a:blip r:embed="rId7"/>
                     <a:stretch>
                       <a:fillRect/>
                     </a:stretch>
@@ -874,15 +803,15 @@
     </w:p>
     <w:p>
       <w:r>
+        <w:t xml:space="preserve">3. </w:t>
+      </w:r>
+    </w:p>
+    <w:p>
+      <w:r>
+        <w:rPr>
+          <w:noProof/>
+        </w:rPr>
         <w:lastRenderedPageBreak/>
-        <w:t xml:space="preserve">3. </w:t>
-      </w:r>
-    </w:p>
-    <w:p>
-      <w:r>
-        <w:rPr>
-          <w:noProof/>
-        </w:rPr>
         <w:drawing>
           <wp:inline distT="0" distB="0" distL="0" distR="0" wp14:anchorId="31BCC9E2" wp14:editId="593C4EBD">
             <wp:extent cx="3324225" cy="4324350"/>
@@ -899,7 +828,7 @@
                     <pic:cNvPicPr/>
                   </pic:nvPicPr>
                   <pic:blipFill>
-                    <a:blip r:embed="rId9"/>
+                    <a:blip r:embed="rId8"/>
                     <a:stretch>
                       <a:fillRect/>
                     </a:stretch>
@@ -999,15 +928,15 @@
     </w:p>
     <w:p>
       <w:r>
+        <w:t>GET_AVG_SALARY</w:t>
+      </w:r>
+      <w:r>
+        <w:t xml:space="preserve"> – Funkcja zwracająca średnie zarobki pracowników </w:t>
+      </w:r>
+    </w:p>
+    <w:p>
+      <w:r>
         <w:lastRenderedPageBreak/>
-        <w:t>GET_AVG_SALARY</w:t>
-      </w:r>
-      <w:r>
-        <w:t xml:space="preserve"> – Funkcja zwracająca średnie zarobki pracowników </w:t>
-      </w:r>
-    </w:p>
-    <w:p>
-      <w:r>
         <w:t>GET_DARCZYNCY</w:t>
       </w:r>
       <w:r>
@@ -1161,7 +1090,7 @@
                     <pic:cNvPicPr/>
                   </pic:nvPicPr>
                   <pic:blipFill>
-                    <a:blip r:embed="rId10"/>
+                    <a:blip r:embed="rId9"/>
                     <a:stretch>
                       <a:fillRect/>
                     </a:stretch>
@@ -1406,6 +1335,50 @@
       </w:pPr>
     </w:p>
     <w:p>
+      <w:pPr>
+        <w:jc w:val="center"/>
+        <w:rPr>
+          <w:b/>
+          <w:bCs/>
+          <w:u w:val="single"/>
+        </w:rPr>
+      </w:pPr>
+      <w:r>
+        <w:rPr>
+          <w:b/>
+          <w:bCs/>
+          <w:u w:val="single"/>
+        </w:rPr>
+        <w:t>NAZWA UŻYTKOWNIKA: schronisko</w:t>
+      </w:r>
+    </w:p>
+    <w:p>
+      <w:pPr>
+        <w:jc w:val="center"/>
+        <w:rPr>
+          <w:b/>
+          <w:bCs/>
+          <w:u w:val="single"/>
+        </w:rPr>
+      </w:pPr>
+      <w:r>
+        <w:rPr>
+          <w:b/>
+          <w:bCs/>
+          <w:u w:val="single"/>
+        </w:rPr>
+        <w:t>HASŁO: 123</w:t>
+      </w:r>
+    </w:p>
+    <w:p>
+      <w:pPr>
+        <w:rPr>
+          <w:b/>
+          <w:bCs/>
+        </w:rPr>
+      </w:pPr>
+    </w:p>
+    <w:p>
       <w:r>
         <w:t>Proces użytkowania Bazy danych wygląda następująco:</w:t>
       </w:r>
@@ -1438,6 +1411,7 @@
         <w:rPr>
           <w:noProof/>
         </w:rPr>
+        <w:lastRenderedPageBreak/>
         <w:drawing>
           <wp:inline distT="0" distB="0" distL="0" distR="0" wp14:anchorId="6940873C" wp14:editId="6647782D">
             <wp:extent cx="5760720" cy="1253490"/>
@@ -1454,7 +1428,7 @@
                     <pic:cNvPicPr/>
                   </pic:nvPicPr>
                   <pic:blipFill>
-                    <a:blip r:embed="rId11"/>
+                    <a:blip r:embed="rId10"/>
                     <a:stretch>
                       <a:fillRect/>
                     </a:stretch>
@@ -1495,7 +1469,6 @@
         <w:rPr>
           <w:noProof/>
         </w:rPr>
-        <w:lastRenderedPageBreak/>
         <w:drawing>
           <wp:inline distT="0" distB="0" distL="0" distR="0" wp14:anchorId="27B222EB" wp14:editId="7988330D">
             <wp:extent cx="5760720" cy="3742055"/>
@@ -1512,7 +1485,7 @@
                     <pic:cNvPicPr/>
                   </pic:nvPicPr>
                   <pic:blipFill>
-                    <a:blip r:embed="rId12"/>
+                    <a:blip r:embed="rId11"/>
                     <a:stretch>
                       <a:fillRect/>
                     </a:stretch>
@@ -1582,7 +1555,7 @@
                     <pic:cNvPicPr/>
                   </pic:nvPicPr>
                   <pic:blipFill>
-                    <a:blip r:embed="rId13"/>
+                    <a:blip r:embed="rId12"/>
                     <a:stretch>
                       <a:fillRect/>
                     </a:stretch>
@@ -1639,7 +1612,7 @@
                     <pic:cNvPicPr/>
                   </pic:nvPicPr>
                   <pic:blipFill>
-                    <a:blip r:embed="rId14"/>
+                    <a:blip r:embed="rId13"/>
                     <a:stretch>
                       <a:fillRect/>
                     </a:stretch>
@@ -1681,7 +1654,11 @@
       </w:r>
       <w:proofErr w:type="spellEnd"/>
       <w:r>
-        <w:t>” Możemy znaleźć interesujący nas wynik. Klikając w przycisk „Dodaj zwierzę” możemy dodać nowy rekord.</w:t>
+        <w:t xml:space="preserve">” Możemy </w:t>
+      </w:r>
+      <w:r>
+        <w:lastRenderedPageBreak/>
+        <w:t>znaleźć interesujący nas wynik. Klikając w przycisk „Dodaj zwierzę” możemy dodać nowy rekord.</w:t>
       </w:r>
     </w:p>
     <w:p>
@@ -1709,7 +1686,6 @@
         <w:rPr>
           <w:noProof/>
         </w:rPr>
-        <w:lastRenderedPageBreak/>
         <w:drawing>
           <wp:inline distT="0" distB="0" distL="0" distR="0" wp14:anchorId="67E626A4" wp14:editId="4BC74B63">
             <wp:extent cx="5760720" cy="3215005"/>
@@ -1726,7 +1702,7 @@
                     <pic:cNvPicPr/>
                   </pic:nvPicPr>
                   <pic:blipFill>
-                    <a:blip r:embed="rId15"/>
+                    <a:blip r:embed="rId14"/>
                     <a:stretch>
                       <a:fillRect/>
                     </a:stretch>
@@ -1864,6 +1840,7 @@
         <w:rPr>
           <w:noProof/>
         </w:rPr>
+        <w:lastRenderedPageBreak/>
         <w:drawing>
           <wp:inline distT="0" distB="0" distL="0" distR="0" wp14:anchorId="1751D9FC" wp14:editId="635B5960">
             <wp:extent cx="5760720" cy="2551430"/>
@@ -1880,7 +1857,7 @@
                     <pic:cNvPicPr/>
                   </pic:nvPicPr>
                   <pic:blipFill>
-                    <a:blip r:embed="rId16"/>
+                    <a:blip r:embed="rId15"/>
                     <a:stretch>
                       <a:fillRect/>
                     </a:stretch>
@@ -1910,7 +1887,6 @@
         </w:numPr>
       </w:pPr>
       <w:r>
-        <w:lastRenderedPageBreak/>
         <w:t xml:space="preserve">Użycie skryptu </w:t>
       </w:r>
       <w:proofErr w:type="spellStart"/>
@@ -1954,7 +1930,7 @@
                     <pic:cNvPicPr/>
                   </pic:nvPicPr>
                   <pic:blipFill>
-                    <a:blip r:embed="rId17"/>
+                    <a:blip r:embed="rId16"/>
                     <a:stretch>
                       <a:fillRect/>
                     </a:stretch>
@@ -2008,6 +1984,7 @@
         <w:rPr>
           <w:noProof/>
         </w:rPr>
+        <w:lastRenderedPageBreak/>
         <w:drawing>
           <wp:inline distT="0" distB="0" distL="0" distR="0" wp14:anchorId="6C5FAA9F" wp14:editId="4B65F775">
             <wp:extent cx="5760720" cy="3284220"/>
@@ -2024,7 +2001,7 @@
                     <pic:cNvPicPr/>
                   </pic:nvPicPr>
                   <pic:blipFill>
-                    <a:blip r:embed="rId18"/>
+                    <a:blip r:embed="rId17"/>
                     <a:stretch>
                       <a:fillRect/>
                     </a:stretch>
@@ -2055,7 +2032,6 @@
         <w:rPr>
           <w:noProof/>
         </w:rPr>
-        <w:lastRenderedPageBreak/>
         <w:drawing>
           <wp:inline distT="0" distB="0" distL="0" distR="0" wp14:anchorId="5558E05A" wp14:editId="084B8BA4">
             <wp:extent cx="5760720" cy="2663825"/>
@@ -2072,7 +2048,7 @@
                     <pic:cNvPicPr/>
                   </pic:nvPicPr>
                   <pic:blipFill>
-                    <a:blip r:embed="rId19"/>
+                    <a:blip r:embed="rId18"/>
                     <a:stretch>
                       <a:fillRect/>
                     </a:stretch>
@@ -4384,6 +4360,7 @@
   <w:style w:type="character" w:default="1" w:styleId="Domylnaczcionkaakapitu">
     <w:name w:val="Default Paragraph Font"/>
     <w:uiPriority w:val="1"/>
+    <w:semiHidden/>
     <w:unhideWhenUsed/>
   </w:style>
   <w:style w:type="table" w:default="1" w:styleId="Standardowy">

</xml_diff>